<commit_message>
Small changes and documentation
</commit_message>
<xml_diff>
--- a/Web Project Development Document.docx
+++ b/Web Project Development Document.docx
@@ -14,6 +14,697 @@
           <w:lang w:val="en-US"/>
         </w:rPr>
         <w:t>Web Project Development Document</w:t>
+      </w:r>
+    </w:p>
+    <w:p>
+      <w:pPr>
+        <w:pStyle w:val="Heading2"/>
+        <w:rPr>
+          <w:lang w:val="en-US"/>
+        </w:rPr>
+      </w:pPr>
+      <w:r>
+        <w:rPr>
+          <w:lang w:val="en-US"/>
+        </w:rPr>
+        <w:t>Aims and Specification</w:t>
+      </w:r>
+    </w:p>
+    <w:p>
+      <w:pPr>
+        <w:rPr>
+          <w:lang w:val="en-US"/>
+        </w:rPr>
+      </w:pPr>
+      <w:r>
+        <w:rPr>
+          <w:lang w:val="en-US"/>
+        </w:rPr>
+        <w:t xml:space="preserve">The project that I </w:t>
+      </w:r>
+      <w:r>
+        <w:rPr>
+          <w:lang w:val="en-US"/>
+        </w:rPr>
+        <w:t>set out to build is called MythMapper, it is essentially a custom world builder, in which users are provided a map</w:t>
+      </w:r>
+      <w:r>
+        <w:rPr>
+          <w:lang w:val="en-US"/>
+        </w:rPr>
+        <w:t>, that they can add their own content on top of</w:t>
+      </w:r>
+      <w:r>
+        <w:rPr>
+          <w:lang w:val="en-US"/>
+        </w:rPr>
+        <w:t xml:space="preserve">. For example, various location types. It </w:t>
+      </w:r>
+      <w:r>
+        <w:rPr>
+          <w:lang w:val="en-US"/>
+        </w:rPr>
+        <w:t xml:space="preserve">is </w:t>
+      </w:r>
+      <w:r>
+        <w:rPr>
+          <w:lang w:val="en-US"/>
+        </w:rPr>
+        <w:t xml:space="preserve">mainly </w:t>
+      </w:r>
+      <w:r>
+        <w:rPr>
+          <w:lang w:val="en-US"/>
+        </w:rPr>
+        <w:t xml:space="preserve">aimed </w:t>
+      </w:r>
+      <w:r>
+        <w:rPr>
+          <w:lang w:val="en-US"/>
+        </w:rPr>
+        <w:t>for authors that wanted to provide a visual representation of the world that they are writing about,</w:t>
+      </w:r>
+      <w:r>
+        <w:rPr>
+          <w:lang w:val="en-US"/>
+        </w:rPr>
+        <w:t xml:space="preserve"> that users can view and interact with, giving them a better understanding of the world, hopefully getting them more interested and </w:t>
+      </w:r>
+      <w:r>
+        <w:rPr>
+          <w:lang w:val="en-US"/>
+        </w:rPr>
+        <w:t>invested in the reading.</w:t>
+      </w:r>
+      <w:r>
+        <w:rPr>
+          <w:lang w:val="en-US"/>
+        </w:rPr>
+        <w:t xml:space="preserve"> </w:t>
+      </w:r>
+      <w:r>
+        <w:rPr>
+          <w:lang w:val="en-US"/>
+        </w:rPr>
+        <w:t xml:space="preserve">I’ve chosen a universal image as the map for each </w:t>
+      </w:r>
+      <w:r>
+        <w:rPr>
+          <w:lang w:val="en-US"/>
+        </w:rPr>
+        <w:t>world;</w:t>
+      </w:r>
+      <w:r>
+        <w:rPr>
+          <w:lang w:val="en-US"/>
+        </w:rPr>
+        <w:t xml:space="preserve"> users can add their own customizations on top of it</w:t>
+      </w:r>
+      <w:r>
+        <w:rPr>
+          <w:lang w:val="en-US"/>
+        </w:rPr>
+        <w:t xml:space="preserve">. In </w:t>
+      </w:r>
+      <w:r>
+        <w:rPr>
+          <w:lang w:val="en-US"/>
+        </w:rPr>
+        <w:t xml:space="preserve">future improvements, I would like to be able to give the creator the option to </w:t>
+      </w:r>
+      <w:r>
+        <w:rPr>
+          <w:lang w:val="en-US"/>
+        </w:rPr>
+        <w:t>import</w:t>
+      </w:r>
+      <w:r>
+        <w:rPr>
+          <w:lang w:val="en-US"/>
+        </w:rPr>
+        <w:t xml:space="preserve"> their own created image as a map backdrop.</w:t>
+      </w:r>
+      <w:r>
+        <w:rPr>
+          <w:lang w:val="en-US"/>
+        </w:rPr>
+        <w:t xml:space="preserve"> </w:t>
+      </w:r>
+      <w:r>
+        <w:rPr>
+          <w:lang w:val="en-US"/>
+        </w:rPr>
+        <w:t>This would of</w:t>
+      </w:r>
+      <w:r>
+        <w:rPr>
+          <w:lang w:val="en-US"/>
+        </w:rPr>
+        <w:t xml:space="preserve"> </w:t>
+      </w:r>
+      <w:r>
+        <w:rPr>
+          <w:lang w:val="en-US"/>
+        </w:rPr>
+        <w:t>course allow for more customization, like adding roads, rivers,</w:t>
+      </w:r>
+      <w:r>
+        <w:rPr>
+          <w:lang w:val="en-US"/>
+        </w:rPr>
+        <w:t xml:space="preserve"> and various other location types</w:t>
+      </w:r>
+      <w:r>
+        <w:rPr>
+          <w:lang w:val="en-US"/>
+        </w:rPr>
+        <w:t>.</w:t>
+      </w:r>
+      <w:r>
+        <w:rPr>
+          <w:lang w:val="en-US"/>
+        </w:rPr>
+        <w:t xml:space="preserve"> </w:t>
+      </w:r>
+      <w:r>
+        <w:rPr>
+          <w:lang w:val="en-US"/>
+        </w:rPr>
+        <w:t>Anothe</w:t>
+      </w:r>
+      <w:r>
+        <w:rPr>
+          <w:lang w:val="en-US"/>
+        </w:rPr>
+        <w:t>r</w:t>
+      </w:r>
+      <w:r>
+        <w:rPr>
+          <w:lang w:val="en-US"/>
+        </w:rPr>
+        <w:t xml:space="preserve"> audience that this is tailored to is </w:t>
+      </w:r>
+      <w:r>
+        <w:rPr>
+          <w:lang w:val="en-US"/>
+        </w:rPr>
+        <w:t xml:space="preserve">the </w:t>
+      </w:r>
+      <w:r>
+        <w:rPr>
+          <w:lang w:val="en-US"/>
+        </w:rPr>
+        <w:t xml:space="preserve">fantasy dungeons and </w:t>
+      </w:r>
+      <w:r>
+        <w:rPr>
+          <w:lang w:val="en-US"/>
+        </w:rPr>
+        <w:t>dragon’s</w:t>
+      </w:r>
+      <w:r>
+        <w:rPr>
+          <w:lang w:val="en-US"/>
+        </w:rPr>
+        <w:t xml:space="preserve"> world, </w:t>
+      </w:r>
+      <w:r>
+        <w:rPr>
+          <w:lang w:val="en-US"/>
+        </w:rPr>
+        <w:t>so players can be given a visual representation of the world that they are playing in</w:t>
+      </w:r>
+      <w:r>
+        <w:rPr>
+          <w:lang w:val="en-US"/>
+        </w:rPr>
+        <w:t xml:space="preserve">. </w:t>
+      </w:r>
+      <w:r>
+        <w:rPr>
+          <w:lang w:val="en-US"/>
+        </w:rPr>
+        <w:t xml:space="preserve">This </w:t>
+      </w:r>
+      <w:r>
+        <w:rPr>
+          <w:lang w:val="en-US"/>
+        </w:rPr>
+        <w:t>is</w:t>
+      </w:r>
+      <w:r>
+        <w:rPr>
+          <w:lang w:val="en-US"/>
+        </w:rPr>
+        <w:t xml:space="preserve"> more of a side</w:t>
+      </w:r>
+      <w:r>
+        <w:rPr>
+          <w:lang w:val="en-US"/>
+        </w:rPr>
+        <w:t xml:space="preserve"> audience, the main one being authors displaying their worlds to their readers.</w:t>
+      </w:r>
+    </w:p>
+    <w:p>
+      <w:pPr>
+        <w:rPr>
+          <w:lang w:val="en-US"/>
+        </w:rPr>
+      </w:pPr>
+      <w:r>
+        <w:rPr>
+          <w:lang w:val="en-US"/>
+        </w:rPr>
+        <w:t xml:space="preserve">The main key features of my webapp are the map functionality, and the users adding their own markers onto the map, customizing it. They are also able to view other </w:t>
+      </w:r>
+      <w:r>
+        <w:rPr>
+          <w:lang w:val="en-US"/>
+        </w:rPr>
+        <w:t>users’</w:t>
+      </w:r>
+      <w:r>
+        <w:rPr>
+          <w:lang w:val="en-US"/>
+        </w:rPr>
+        <w:t xml:space="preserve"> maps (once they have been published</w:t>
+      </w:r>
+      <w:r>
+        <w:rPr>
+          <w:lang w:val="en-US"/>
+        </w:rPr>
+        <w:t>).</w:t>
+      </w:r>
+    </w:p>
+    <w:p>
+      <w:pPr>
+        <w:rPr>
+          <w:lang w:val="en-US"/>
+        </w:rPr>
+      </w:pPr>
+      <w:r>
+        <w:rPr>
+          <w:lang w:val="en-US"/>
+        </w:rPr>
+        <w:t xml:space="preserve">The main inspiration for this project, came from watching game of thrones. I looked for an interactive map </w:t>
+      </w:r>
+      <w:r>
+        <w:rPr>
+          <w:lang w:val="en-US"/>
+        </w:rPr>
+        <w:t xml:space="preserve">and found a highly interactive map with locations, characters </w:t>
+      </w:r>
+      <w:r>
+        <w:rPr>
+          <w:lang w:val="en-US"/>
+        </w:rPr>
+        <w:t xml:space="preserve">etc. </w:t>
+      </w:r>
+      <w:r>
+        <w:rPr>
+          <w:lang w:val="en-US"/>
+        </w:rPr>
+        <w:t xml:space="preserve">Tear of the Cartographers Guild </w:t>
+      </w:r>
+      <w:r>
+        <w:rPr>
+          <w:lang w:val="en-US"/>
+        </w:rPr>
+        <w:t>(2012)</w:t>
+      </w:r>
+      <w:r>
+        <w:rPr>
+          <w:lang w:val="en-US"/>
+        </w:rPr>
+        <w:t xml:space="preserve">. </w:t>
+      </w:r>
+      <w:r>
+        <w:rPr>
+          <w:lang w:val="en-US"/>
+        </w:rPr>
+        <w:t xml:space="preserve">It gave me the inspiration to create my </w:t>
+      </w:r>
+      <w:r>
+        <w:rPr>
+          <w:lang w:val="en-US"/>
+        </w:rPr>
+        <w:t>project</w:t>
+      </w:r>
+      <w:r>
+        <w:rPr>
+          <w:lang w:val="en-US"/>
+        </w:rPr>
+        <w:t>.</w:t>
+      </w:r>
+      <w:r>
+        <w:rPr>
+          <w:lang w:val="en-US"/>
+        </w:rPr>
+        <w:t xml:space="preserve"> </w:t>
+      </w:r>
+      <w:r>
+        <w:rPr>
+          <w:lang w:val="en-US"/>
+        </w:rPr>
+        <w:t xml:space="preserve">I thought it would be an interesting project that lets other authors </w:t>
+      </w:r>
+      <w:r>
+        <w:rPr>
+          <w:lang w:val="en-US"/>
+        </w:rPr>
+        <w:t xml:space="preserve">create a similar (although much less complicated) map for their </w:t>
+      </w:r>
+      <w:r>
+        <w:rPr>
+          <w:lang w:val="en-US"/>
+        </w:rPr>
+        <w:t xml:space="preserve">fantasy </w:t>
+      </w:r>
+      <w:r>
+        <w:rPr>
+          <w:lang w:val="en-US"/>
+        </w:rPr>
+        <w:t>books.</w:t>
+      </w:r>
+    </w:p>
+    <w:p>
+      <w:pPr>
+        <w:pStyle w:val="Heading2"/>
+        <w:rPr>
+          <w:lang w:val="en-US"/>
+        </w:rPr>
+      </w:pPr>
+      <w:r>
+        <w:rPr>
+          <w:lang w:val="en-US"/>
+        </w:rPr>
+        <w:t>User Experience Design</w:t>
+      </w:r>
+    </w:p>
+    <w:p>
+      <w:pPr>
+        <w:rPr>
+          <w:lang w:val="en-US"/>
+        </w:rPr>
+      </w:pPr>
+      <w:r>
+        <w:rPr>
+          <w:lang w:val="en-US"/>
+        </w:rPr>
+        <w:t xml:space="preserve">The landing page for my web app is the home page. I wanted it to be obvious what the core functionality of the app is right away for the user. </w:t>
+      </w:r>
+      <w:r>
+        <w:rPr>
+          <w:lang w:val="en-US"/>
+        </w:rPr>
+        <w:t>So,</w:t>
+      </w:r>
+      <w:r>
+        <w:rPr>
+          <w:lang w:val="en-US"/>
+        </w:rPr>
+        <w:t xml:space="preserve"> </w:t>
+      </w:r>
+      <w:r>
+        <w:rPr>
+          <w:lang w:val="en-US"/>
+        </w:rPr>
+        <w:t>the main feature of the home page is a display map, that I have created for all users (I replicated some game of thrones locations as examples)</w:t>
+      </w:r>
+      <w:r>
+        <w:rPr>
+          <w:lang w:val="en-US"/>
+        </w:rPr>
+        <w:t xml:space="preserve">. I also wanted to make it obvious for the user, the journey that they can take on my webapp, so I displayed some text explaining what they </w:t>
+      </w:r>
+      <w:r>
+        <w:rPr>
+          <w:lang w:val="en-US"/>
+        </w:rPr>
+        <w:t xml:space="preserve">can do and </w:t>
+      </w:r>
+      <w:r>
+        <w:rPr>
+          <w:lang w:val="en-US"/>
+        </w:rPr>
+        <w:t>must</w:t>
+      </w:r>
+      <w:r>
+        <w:rPr>
+          <w:lang w:val="en-US"/>
+        </w:rPr>
+        <w:t xml:space="preserve"> do (for example registering so they can create their own maps). </w:t>
+      </w:r>
+      <w:r>
+        <w:rPr>
+          <w:lang w:val="en-US"/>
+        </w:rPr>
+        <w:t>By design, I decided to make it necessary for users to register if they wanted to create their own maps, however if all they wanted to do was view published maps, they are not required to sign in to reach that page.</w:t>
+      </w:r>
+    </w:p>
+    <w:p>
+      <w:pPr>
+        <w:rPr>
+          <w:lang w:val="en-US"/>
+        </w:rPr>
+      </w:pPr>
+      <w:r>
+        <w:rPr>
+          <w:lang w:val="en-US"/>
+        </w:rPr>
+        <w:t xml:space="preserve">Users don’t interact with one another directly in my </w:t>
+      </w:r>
+      <w:r>
+        <w:rPr>
+          <w:lang w:val="en-US"/>
+        </w:rPr>
+        <w:t>webapp;</w:t>
+      </w:r>
+      <w:r>
+        <w:rPr>
+          <w:lang w:val="en-US"/>
+        </w:rPr>
+        <w:t xml:space="preserve"> however, they are able to view and interact with each other’s maps, through the </w:t>
+      </w:r>
+      <w:r>
+        <w:rPr>
+          <w:lang w:val="en-US"/>
+        </w:rPr>
+        <w:t>“View Other</w:t>
+      </w:r>
+      <w:r>
+        <w:rPr>
+          <w:lang w:val="en-US"/>
+        </w:rPr>
+        <w:t>s’</w:t>
+      </w:r>
+      <w:r>
+        <w:rPr>
+          <w:lang w:val="en-US"/>
+        </w:rPr>
+        <w:t xml:space="preserve"> Maps” page.</w:t>
+      </w:r>
+      <w:r>
+        <w:rPr>
+          <w:lang w:val="en-US"/>
+        </w:rPr>
+        <w:t xml:space="preserve"> Once a user has published their map, </w:t>
+      </w:r>
+      <w:r>
+        <w:rPr>
+          <w:lang w:val="en-US"/>
+        </w:rPr>
+        <w:t>they are then displayed in the list of published maps</w:t>
+      </w:r>
+      <w:r>
+        <w:rPr>
+          <w:lang w:val="en-US"/>
+        </w:rPr>
+        <w:t xml:space="preserve"> as “map</w:t>
+      </w:r>
+      <w:r>
+        <w:rPr>
+          <w:lang w:val="en-US"/>
+        </w:rPr>
+        <w:t xml:space="preserve"> </w:t>
+      </w:r>
+      <w:r>
+        <w:rPr>
+          <w:lang w:val="en-US"/>
+        </w:rPr>
+        <w:t>name by: username</w:t>
+      </w:r>
+      <w:r>
+        <w:rPr>
+          <w:lang w:val="en-US"/>
+        </w:rPr>
+        <w:t>”</w:t>
+      </w:r>
+      <w:r>
+        <w:rPr>
+          <w:lang w:val="en-US"/>
+        </w:rPr>
+        <w:t>, this is why it is necessary for users to register a</w:t>
+      </w:r>
+      <w:r>
+        <w:rPr>
+          <w:lang w:val="en-US"/>
+        </w:rPr>
+        <w:t>n</w:t>
+      </w:r>
+      <w:r>
+        <w:rPr>
+          <w:lang w:val="en-US"/>
+        </w:rPr>
+        <w:t xml:space="preserve"> account before being allowed to create maps</w:t>
+      </w:r>
+      <w:r>
+        <w:rPr>
+          <w:lang w:val="en-US"/>
+        </w:rPr>
+        <w:t>. Creators can still edit their maps once they are published, and edits will automatically be displayed on their published maps, once saved to the database.</w:t>
+      </w:r>
+    </w:p>
+    <w:p>
+      <w:pPr>
+        <w:pStyle w:val="Heading2"/>
+        <w:rPr>
+          <w:lang w:val="en-US"/>
+        </w:rPr>
+      </w:pPr>
+      <w:r>
+        <w:rPr>
+          <w:lang w:val="en-US"/>
+        </w:rPr>
+        <w:lastRenderedPageBreak/>
+        <w:t>References</w:t>
+      </w:r>
+    </w:p>
+    <w:p>
+      <w:pPr>
+        <w:rPr>
+          <w:lang w:val="en-US"/>
+        </w:rPr>
+      </w:pPr>
+      <w:r>
+        <w:rPr>
+          <w:rFonts w:ascii="avenir-regular-class" w:hAnsi="avenir-regular-class"/>
+          <w:color w:val="333333"/>
+          <w:sz w:val="23"/>
+          <w:szCs w:val="23"/>
+          <w:shd w:val="clear" w:color="auto" w:fill="FBFBFB"/>
+        </w:rPr>
+        <w:t xml:space="preserve">Tear of the </w:t>
+      </w:r>
+      <w:r>
+        <w:rPr>
+          <w:rFonts w:ascii="avenir-regular-class" w:hAnsi="avenir-regular-class"/>
+          <w:color w:val="333333"/>
+          <w:sz w:val="23"/>
+          <w:szCs w:val="23"/>
+          <w:shd w:val="clear" w:color="auto" w:fill="FBFBFB"/>
+        </w:rPr>
+        <w:t>Cartographers Guild</w:t>
+      </w:r>
+      <w:r>
+        <w:rPr>
+          <w:rFonts w:ascii="avenir-regular-class" w:hAnsi="avenir-regular-class"/>
+          <w:color w:val="333333"/>
+          <w:sz w:val="23"/>
+          <w:szCs w:val="23"/>
+          <w:shd w:val="clear" w:color="auto" w:fill="FBFBFB"/>
+        </w:rPr>
+        <w:t>. (</w:t>
+      </w:r>
+      <w:r>
+        <w:rPr>
+          <w:rFonts w:ascii="avenir-regular-class" w:hAnsi="avenir-regular-class"/>
+          <w:color w:val="333333"/>
+          <w:sz w:val="23"/>
+          <w:szCs w:val="23"/>
+          <w:shd w:val="clear" w:color="auto" w:fill="FBFBFB"/>
+        </w:rPr>
+        <w:t>2012</w:t>
+      </w:r>
+      <w:r>
+        <w:rPr>
+          <w:rFonts w:ascii="avenir-regular-class" w:hAnsi="avenir-regular-class"/>
+          <w:color w:val="333333"/>
+          <w:sz w:val="23"/>
+          <w:szCs w:val="23"/>
+          <w:shd w:val="clear" w:color="auto" w:fill="FBFBFB"/>
+        </w:rPr>
+        <w:t>) </w:t>
+      </w:r>
+      <w:r>
+        <w:rPr>
+          <w:rFonts w:ascii="avenir-regular-class" w:hAnsi="avenir-regular-class"/>
+          <w:color w:val="333333"/>
+          <w:sz w:val="23"/>
+          <w:szCs w:val="23"/>
+          <w:shd w:val="clear" w:color="auto" w:fill="FBFBFB"/>
+        </w:rPr>
+        <w:t>A song of Ice and Fire Speculative World Map</w:t>
+      </w:r>
+      <w:r>
+        <w:rPr>
+          <w:rFonts w:ascii="avenir-regular-class" w:hAnsi="avenir-regular-class"/>
+          <w:color w:val="333333"/>
+          <w:sz w:val="23"/>
+          <w:szCs w:val="23"/>
+          <w:shd w:val="clear" w:color="auto" w:fill="FBFBFB"/>
+        </w:rPr>
+        <w:t xml:space="preserve">. Available at: </w:t>
+      </w:r>
+      <w:r>
+        <w:rPr>
+          <w:rFonts w:ascii="avenir-regular-class" w:hAnsi="avenir-regular-class"/>
+          <w:color w:val="333333"/>
+          <w:sz w:val="23"/>
+          <w:szCs w:val="23"/>
+          <w:shd w:val="clear" w:color="auto" w:fill="FBFBFB"/>
+        </w:rPr>
+        <w:t>https://quartermaester.info/</w:t>
+      </w:r>
+      <w:r>
+        <w:rPr>
+          <w:rFonts w:ascii="avenir-regular-class" w:hAnsi="avenir-regular-class"/>
+          <w:color w:val="333333"/>
+          <w:sz w:val="23"/>
+          <w:szCs w:val="23"/>
+          <w:shd w:val="clear" w:color="auto" w:fill="FBFBFB"/>
+        </w:rPr>
+        <w:t xml:space="preserve"> </w:t>
+      </w:r>
+      <w:r>
+        <w:rPr>
+          <w:rFonts w:ascii="avenir-regular-class" w:hAnsi="avenir-regular-class"/>
+          <w:color w:val="333333"/>
+          <w:sz w:val="23"/>
+          <w:szCs w:val="23"/>
+          <w:shd w:val="clear" w:color="auto" w:fill="FBFBFB"/>
+        </w:rPr>
+        <w:t xml:space="preserve">(Accessed: </w:t>
+      </w:r>
+      <w:r>
+        <w:rPr>
+          <w:rFonts w:ascii="avenir-regular-class" w:hAnsi="avenir-regular-class"/>
+          <w:color w:val="333333"/>
+          <w:sz w:val="23"/>
+          <w:szCs w:val="23"/>
+          <w:shd w:val="clear" w:color="auto" w:fill="FBFBFB"/>
+        </w:rPr>
+        <w:t>08/01/26</w:t>
+      </w:r>
+      <w:r>
+        <w:rPr>
+          <w:rFonts w:ascii="avenir-regular-class" w:hAnsi="avenir-regular-class"/>
+          <w:color w:val="333333"/>
+          <w:sz w:val="23"/>
+          <w:szCs w:val="23"/>
+          <w:shd w:val="clear" w:color="auto" w:fill="FBFBFB"/>
+        </w:rPr>
+        <w:t>).</w:t>
       </w:r>
     </w:p>
     <w:sectPr>
@@ -508,7 +1199,6 @@
     <w:next w:val="Normal"/>
     <w:link w:val="Heading2Char"/>
     <w:uiPriority w:val="9"/>
-    <w:semiHidden/>
     <w:unhideWhenUsed/>
     <w:qFormat/>
     <w:rsid w:val="003E2B2F"/>
@@ -723,7 +1413,6 @@
     <w:basedOn w:val="DefaultParagraphFont"/>
     <w:link w:val="Heading2"/>
     <w:uiPriority w:val="9"/>
-    <w:semiHidden/>
     <w:rsid w:val="003E2B2F"/>
     <w:rPr>
       <w:rFonts w:asciiTheme="majorHAnsi" w:eastAsiaTheme="majorEastAsia" w:hAnsiTheme="majorHAnsi" w:cstheme="majorBidi"/>

</xml_diff>

<commit_message>
Update Web Project Development Document.docx
</commit_message>
<xml_diff>
--- a/Web Project Development Document.docx
+++ b/Web Project Development Document.docx
@@ -567,6 +567,57 @@
     </w:p>
     <w:p>
       <w:pPr>
+        <w:rPr>
+          <w:lang w:val="en-US"/>
+        </w:rPr>
+      </w:pPr>
+      <w:r>
+        <w:rPr>
+          <w:lang w:val="en-US"/>
+        </w:rPr>
+        <w:t xml:space="preserve">As for the design, I went with a simplistic, clean looking webapp. I thought this would help emphasize the main features and not distract from them. I also just prefer how more simplistic websites look. For example, </w:t>
+      </w:r>
+      <w:r>
+        <w:rPr>
+          <w:lang w:val="en-US"/>
+        </w:rPr>
+        <w:t xml:space="preserve">the navbar is very simplistic, but I think it </w:t>
+      </w:r>
+      <w:r>
+        <w:rPr>
+          <w:lang w:val="en-US"/>
+        </w:rPr>
+        <w:lastRenderedPageBreak/>
+        <w:t>still fits with the overall design of the website.</w:t>
+      </w:r>
+      <w:r>
+        <w:rPr>
+          <w:lang w:val="en-US"/>
+        </w:rPr>
+        <w:t xml:space="preserve"> Here are some wireframes of how I expected the webapp to be designe</w:t>
+      </w:r>
+      <w:r>
+        <w:rPr>
+          <w:lang w:val="en-US"/>
+        </w:rPr>
+        <w:t>d.</w:t>
+      </w:r>
+    </w:p>
+    <w:p>
+      <w:pPr>
+        <w:rPr>
+          <w:lang w:val="en-US"/>
+        </w:rPr>
+      </w:pPr>
+      <w:r>
+        <w:rPr>
+          <w:lang w:val="en-US"/>
+        </w:rPr>
+        <w:t>//Add the wireframes don’t forget</w:t>
+      </w:r>
+    </w:p>
+    <w:p>
+      <w:pPr>
         <w:pStyle w:val="Heading2"/>
         <w:rPr>
           <w:lang w:val="en-US"/>
@@ -576,7 +627,308 @@
         <w:rPr>
           <w:lang w:val="en-US"/>
         </w:rPr>
-        <w:lastRenderedPageBreak/>
+        <w:t>Database Design</w:t>
+      </w:r>
+    </w:p>
+    <w:p>
+      <w:pPr>
+        <w:rPr>
+          <w:lang w:val="en-US"/>
+        </w:rPr>
+      </w:pPr>
+      <w:r>
+        <w:rPr>
+          <w:lang w:val="en-US"/>
+        </w:rPr>
+        <w:t xml:space="preserve">The database software </w:t>
+      </w:r>
+      <w:r>
+        <w:rPr>
+          <w:lang w:val="en-US"/>
+        </w:rPr>
+        <w:t xml:space="preserve">that I decided to go with is MongoDB. This is because it is integrated with a free </w:t>
+      </w:r>
+      <w:r>
+        <w:rPr>
+          <w:lang w:val="en-US"/>
+        </w:rPr>
+        <w:t xml:space="preserve">online database (MongoDB atlas), and it is </w:t>
+      </w:r>
+      <w:proofErr w:type="gramStart"/>
+      <w:r>
+        <w:rPr>
+          <w:lang w:val="en-US"/>
+        </w:rPr>
+        <w:t>fairly simplistic</w:t>
+      </w:r>
+      <w:proofErr w:type="gramEnd"/>
+      <w:r>
+        <w:rPr>
+          <w:lang w:val="en-US"/>
+        </w:rPr>
+        <w:t xml:space="preserve"> to set up, and works well with what I planned on using it for. It was also the main software that was discussed and taught in our workshops, making it the obvious choice. </w:t>
+      </w:r>
+      <w:r>
+        <w:rPr>
+          <w:lang w:val="en-US"/>
+        </w:rPr>
+        <w:t xml:space="preserve">The software that I mainly interacted with was MongoDB compass. This helped to visualize the databases, and using </w:t>
+      </w:r>
+      <w:r>
+        <w:rPr>
+          <w:lang w:val="en-US"/>
+        </w:rPr>
+        <w:t>some MongoDB libraries (</w:t>
+      </w:r>
+      <w:r>
+        <w:rPr>
+          <w:lang w:val="en-US"/>
+        </w:rPr>
+        <w:t>Mongoose)</w:t>
+      </w:r>
+      <w:r>
+        <w:rPr>
+          <w:lang w:val="en-US"/>
+        </w:rPr>
+        <w:t xml:space="preserve">, I could easily implement it into my code. </w:t>
+      </w:r>
+    </w:p>
+    <w:p>
+      <w:pPr>
+        <w:rPr>
+          <w:lang w:val="en-US"/>
+        </w:rPr>
+      </w:pPr>
+      <w:r>
+        <w:rPr>
+          <w:lang w:val="en-US"/>
+        </w:rPr>
+        <w:t xml:space="preserve">I </w:t>
+      </w:r>
+      <w:r>
+        <w:rPr>
+          <w:lang w:val="en-US"/>
+        </w:rPr>
+        <w:t>had two main schemas for my databases</w:t>
+      </w:r>
+      <w:r>
+        <w:rPr>
+          <w:lang w:val="en-US"/>
+        </w:rPr>
+        <w:t xml:space="preserve">, one of which was to store user data (usernames and passwords), and the other was to store the map data (names, markers </w:t>
+      </w:r>
+      <w:r>
+        <w:rPr>
+          <w:lang w:val="en-US"/>
+        </w:rPr>
+        <w:t>etc.</w:t>
+      </w:r>
+      <w:r>
+        <w:rPr>
+          <w:lang w:val="en-US"/>
+        </w:rPr>
+        <w:t>)</w:t>
+      </w:r>
+    </w:p>
+    <w:p>
+      <w:pPr>
+        <w:rPr>
+          <w:lang w:val="en-US"/>
+        </w:rPr>
+      </w:pPr>
+      <w:r>
+        <w:rPr>
+          <w:lang w:val="en-US"/>
+        </w:rPr>
+        <w:t xml:space="preserve"> </w:t>
+      </w:r>
+      <w:r>
+        <w:rPr>
+          <w:lang w:val="en-US"/>
+        </w:rPr>
+        <w:t>The first schema, the user data, was quite simplistic to create, all it stored was the username, and password of the user once they had registered an account. This was then used to let users log in to their account in the future, and view maps that they had created on that account.</w:t>
+      </w:r>
+      <w:r>
+        <w:rPr>
+          <w:lang w:val="en-US"/>
+        </w:rPr>
+        <w:t xml:space="preserve"> </w:t>
+      </w:r>
+      <w:r>
+        <w:rPr>
+          <w:lang w:val="en-US"/>
+        </w:rPr>
+        <w:t xml:space="preserve">I had already created this code for another project, so it was </w:t>
+      </w:r>
+      <w:r>
+        <w:rPr>
+          <w:lang w:val="en-US"/>
+        </w:rPr>
+        <w:t>easy</w:t>
+      </w:r>
+      <w:r>
+        <w:rPr>
+          <w:lang w:val="en-US"/>
+        </w:rPr>
+        <w:t xml:space="preserve"> to port over. </w:t>
+      </w:r>
+    </w:p>
+    <w:p>
+      <w:pPr>
+        <w:rPr>
+          <w:lang w:val="en-US"/>
+        </w:rPr>
+      </w:pPr>
+      <w:r>
+        <w:rPr>
+          <w:lang w:val="en-US"/>
+        </w:rPr>
+        <w:t>The second schema however, for maps was a bit more complicated. It stored</w:t>
+      </w:r>
+      <w:r>
+        <w:rPr>
+          <w:lang w:val="en-US"/>
+        </w:rPr>
+        <w:t xml:space="preserve"> the map name, markers, owners name and</w:t>
+      </w:r>
+      <w:r>
+        <w:rPr>
+          <w:lang w:val="en-US"/>
+        </w:rPr>
+        <w:t xml:space="preserve"> a </w:t>
+      </w:r>
+      <w:r>
+        <w:rPr>
+          <w:lang w:val="en-US"/>
+        </w:rPr>
+        <w:t>Boolean</w:t>
+      </w:r>
+      <w:r>
+        <w:rPr>
+          <w:lang w:val="en-US"/>
+        </w:rPr>
+        <w:t xml:space="preserve"> to store if it has been published or not.</w:t>
+      </w:r>
+      <w:r>
+        <w:rPr>
+          <w:lang w:val="en-US"/>
+        </w:rPr>
+        <w:t xml:space="preserve"> </w:t>
+      </w:r>
+      <w:r>
+        <w:rPr>
+          <w:lang w:val="en-US"/>
+        </w:rPr>
+        <w:t xml:space="preserve">The only slight challenge with this schema was the markers, because they had to be stored </w:t>
+      </w:r>
+      <w:r>
+        <w:rPr>
+          <w:lang w:val="en-US"/>
+        </w:rPr>
+        <w:t>with coordinates</w:t>
+      </w:r>
+      <w:r>
+        <w:rPr>
+          <w:lang w:val="en-US"/>
+        </w:rPr>
+        <w:t xml:space="preserve">, </w:t>
+      </w:r>
+      <w:r>
+        <w:rPr>
+          <w:lang w:val="en-US"/>
+        </w:rPr>
+        <w:t xml:space="preserve">a </w:t>
+      </w:r>
+      <w:r>
+        <w:rPr>
+          <w:lang w:val="en-US"/>
+        </w:rPr>
+        <w:t>popup (what’s displayed when the user clicks on the marker) and the marker type (</w:t>
+      </w:r>
+      <w:r>
+        <w:rPr>
+          <w:lang w:val="en-US"/>
+        </w:rPr>
+        <w:t>what icon is displayed on the map).</w:t>
+      </w:r>
+      <w:r>
+        <w:rPr>
+          <w:lang w:val="en-US"/>
+        </w:rPr>
+        <w:t xml:space="preserve"> </w:t>
+      </w:r>
+      <w:r>
+        <w:rPr>
+          <w:lang w:val="en-US"/>
+        </w:rPr>
+        <w:t>So,</w:t>
+      </w:r>
+      <w:r>
+        <w:rPr>
+          <w:lang w:val="en-US"/>
+        </w:rPr>
+        <w:t xml:space="preserve"> </w:t>
+      </w:r>
+      <w:r>
+        <w:rPr>
+          <w:lang w:val="en-US"/>
+        </w:rPr>
+        <w:t>to</w:t>
+      </w:r>
+      <w:r>
+        <w:rPr>
+          <w:lang w:val="en-US"/>
+        </w:rPr>
+        <w:t xml:space="preserve"> do this efficiently, I had to make a sperate marker schema and </w:t>
+      </w:r>
+      <w:r>
+        <w:rPr>
+          <w:lang w:val="en-US"/>
+        </w:rPr>
+        <w:t xml:space="preserve">embed it into the </w:t>
+      </w:r>
+      <w:r>
+        <w:rPr>
+          <w:lang w:val="en-US"/>
+        </w:rPr>
+        <w:t xml:space="preserve">map schema. </w:t>
+      </w:r>
+      <w:r>
+        <w:rPr>
+          <w:lang w:val="en-US"/>
+        </w:rPr>
+        <w:t xml:space="preserve">This works </w:t>
+      </w:r>
+      <w:r>
+        <w:rPr>
+          <w:lang w:val="en-US"/>
+        </w:rPr>
+        <w:t>well and</w:t>
+      </w:r>
+      <w:r>
+        <w:rPr>
+          <w:lang w:val="en-US"/>
+        </w:rPr>
+        <w:t xml:space="preserve"> organizes the data effectively.</w:t>
+      </w:r>
+      <w:r>
+        <w:rPr>
+          <w:lang w:val="en-US"/>
+        </w:rPr>
+        <w:t xml:space="preserve"> </w:t>
+      </w:r>
+    </w:p>
+    <w:p>
+      <w:pPr>
+        <w:pStyle w:val="Heading2"/>
+        <w:rPr>
+          <w:lang w:val="en-US"/>
+        </w:rPr>
+      </w:pPr>
+      <w:r>
+        <w:rPr>
+          <w:lang w:val="en-US"/>
+        </w:rPr>
         <w:t>References</w:t>
       </w:r>
     </w:p>

</xml_diff>